<commit_message>
docs(AASPAP01): D4 + D5 — responsáveis por papel + critérios de aceite no REQ
D4 (campo Responsável conforme template):
- REQ: "Gerente de Projeto / Abraão" -> "Responsáveis (Discovery): Cézar (Tech Lead) / Marcos Turnes (PO)" (TPL-REQ-001).
- PCP: -> "Responsáveis: Cézar (Arquiteto / Tech Lead)" (TPL-PCP-001).
- ADAP: "Responsável pela adaptação: Cézar" -> "Abraão Oliveira (Gerente de Projeto)" (TPL-GPR-003).

D5 (critérios de aceite):
- REQ: adicionada a coluna "Critérios de aceite" à tabela de RF (RF01..RF12),
  com critérios DERIVADOS dos casos de teste reais CT-01..CT-12 (REL-VV-AASPAP01-001),
  cada um citando o(s) CT de verificação. Nada inventado.

D6 (registro único de GQA / cadência) deixado como observação (provável over-strict).

Co-Authored-By: Claude Opus 4.8 (1M context) <noreply@anthropic.com>
</commit_message>
<xml_diff>
--- a/mps-nivel-c/oficial/04_registros/AASP_Andamento-Processuais/PCP-AASPAP01-001_Documento-de-Design.docx
+++ b/mps-nivel-c/oficial/04_registros/AASP_Andamento-Processuais/PCP-AASPAP01-001_Documento-de-Design.docx
@@ -416,7 +416,7 @@
                 <w:i w:val="0"/>
                 <w:sz w:val="20"/>
               </w:rPr>
-              <w:t>Gerente de Projeto</w:t>
+              <w:t>Responsáveis</w:t>
             </w:r>
           </w:p>
         </w:tc>
@@ -435,7 +435,7 @@
               <w:spacing w:before="40" w:after="40"/>
             </w:pPr>
             <w:r>
-              <w:t>Abraão Oliveira</w:t>
+              <w:t>Cézar Hiraki Velázquez (Arquiteto / Tech Lead)</w:t>
             </w:r>
           </w:p>
         </w:tc>

</xml_diff>